<commit_message>
update for docs with external volume and OBS troubleshooting instructions
</commit_message>
<xml_diff>
--- a/docs/3.2-Instructions for File Hashing.docx
+++ b/docs/3.2-Instructions for File Hashing.docx
@@ -24,13 +24,19 @@
     </w:p>
     <w:p>
       <w:pPr>
-        <w:jc w:val="center"/>
-        <w:rPr>
-          <w:b w:val="1"/>
+        <w:rPr>
           <w:sz w:val="30"/>
           <w:szCs w:val="30"/>
         </w:rPr>
       </w:pPr>
+      <w:r>
+        <w:rPr>
+          <w:sz w:val="24"/>
+          <w:szCs w:val="24"/>
+          <w:rtl w:val="0"/>
+        </w:rPr>
+        <w:t xml:space="preserve">This document is instructions for creating the hashes and signatures of the docker images and package content to be used for verification in package manager. </w:t>
+      </w:r>
       <w:r>
         <w:rPr>
           <w:rtl w:val="0"/>
@@ -106,7 +112,7 @@
           <w:highlight w:val="white"/>
           <w:rtl w:val="0"/>
         </w:rPr>
-        <w:t xml:space="preserve">Node js (16.11.1)</w:t>
+        <w:t xml:space="preserve">Node js (16)</w:t>
       </w:r>
     </w:p>
     <w:p>
@@ -627,12 +633,12 @@
           <wp:inline distB="114300" distT="114300" distL="114300" distR="114300">
             <wp:extent cx="5943600" cy="292100"/>
             <wp:effectExtent b="0" l="0" r="0" t="0"/>
-            <wp:docPr id="4" name="image6.jpg"/>
+            <wp:docPr id="5" name="image2.jpg"/>
             <a:graphic>
               <a:graphicData uri="http://schemas.openxmlformats.org/drawingml/2006/picture">
                 <pic:pic>
                   <pic:nvPicPr>
-                    <pic:cNvPr id="0" name="image6.jpg"/>
+                    <pic:cNvPr id="0" name="image2.jpg"/>
                     <pic:cNvPicPr preferRelativeResize="0"/>
                   </pic:nvPicPr>
                   <pic:blipFill>
@@ -818,12 +824,12 @@
           <wp:inline distB="114300" distT="114300" distL="114300" distR="114300">
             <wp:extent cx="5943600" cy="1536700"/>
             <wp:effectExtent b="0" l="0" r="0" t="0"/>
-            <wp:docPr id="1" name="image3.png"/>
+            <wp:docPr id="1" name="image6.png"/>
             <a:graphic>
               <a:graphicData uri="http://schemas.openxmlformats.org/drawingml/2006/picture">
                 <pic:pic>
                   <pic:nvPicPr>
-                    <pic:cNvPr id="0" name="image3.png"/>
+                    <pic:cNvPr id="0" name="image6.png"/>
                     <pic:cNvPicPr preferRelativeResize="0"/>
                   </pic:nvPicPr>
                   <pic:blipFill>
@@ -1066,34 +1072,20 @@
       </w:pPr>
       <w:r>
         <w:rPr>
-          <w:rtl w:val="0"/>
-        </w:rPr>
-      </w:r>
-    </w:p>
-    <w:p>
-      <w:pPr>
-        <w:rPr>
-          <w:b w:val="1"/>
-          <w:sz w:val="24"/>
-          <w:szCs w:val="24"/>
-        </w:rPr>
-      </w:pPr>
-      <w:r>
-        <w:rPr>
           <w:b w:val="1"/>
           <w:sz w:val="24"/>
           <w:szCs w:val="24"/>
         </w:rPr>
         <w:drawing>
           <wp:inline distB="114300" distT="114300" distL="114300" distR="114300">
-            <wp:extent cx="5943600" cy="1054100"/>
+            <wp:extent cx="5943600" cy="1257300"/>
             <wp:effectExtent b="0" l="0" r="0" t="0"/>
-            <wp:docPr id="5" name="image2.png"/>
+            <wp:docPr id="4" name="image3.png"/>
             <a:graphic>
               <a:graphicData uri="http://schemas.openxmlformats.org/drawingml/2006/picture">
                 <pic:pic>
                   <pic:nvPicPr>
-                    <pic:cNvPr id="0" name="image2.png"/>
+                    <pic:cNvPr id="0" name="image3.png"/>
                     <pic:cNvPicPr preferRelativeResize="0"/>
                   </pic:nvPicPr>
                   <pic:blipFill>
@@ -1106,7 +1098,7 @@
                   <pic:spPr>
                     <a:xfrm>
                       <a:off x="0" y="0"/>
-                      <a:ext cx="5943600" cy="1054100"/>
+                      <a:ext cx="5943600" cy="1257300"/>
                     </a:xfrm>
                     <a:prstGeom prst="rect"/>
                     <a:ln/>
@@ -1141,6 +1133,20 @@
       <w:pPr>
         <w:rPr>
           <w:b w:val="1"/>
+          <w:sz w:val="24"/>
+          <w:szCs w:val="24"/>
+        </w:rPr>
+      </w:pPr>
+      <w:r>
+        <w:rPr>
+          <w:rtl w:val="0"/>
+        </w:rPr>
+      </w:r>
+    </w:p>
+    <w:p>
+      <w:pPr>
+        <w:rPr>
+          <w:b w:val="1"/>
           <w:color w:val="202124"/>
           <w:sz w:val="24"/>
           <w:szCs w:val="24"/>
@@ -1309,6 +1315,31 @@
           <w:rtl w:val="0"/>
         </w:rPr>
         <w:t xml:space="preserve">port which the transcoding_tool  is listening.</w:t>
+      </w:r>
+    </w:p>
+    <w:p>
+      <w:pPr>
+        <w:rPr>
+          <w:sz w:val="24"/>
+          <w:szCs w:val="24"/>
+        </w:rPr>
+      </w:pPr>
+      <w:r>
+        <w:rPr>
+          <w:b w:val="1"/>
+          <w:sz w:val="24"/>
+          <w:szCs w:val="24"/>
+          <w:rtl w:val="0"/>
+        </w:rPr>
+        <w:t xml:space="preserve">Storage: </w:t>
+      </w:r>
+      <w:r>
+        <w:rPr>
+          <w:sz w:val="24"/>
+          <w:szCs w:val="24"/>
+          <w:rtl w:val="0"/>
+        </w:rPr>
+        <w:t xml:space="preserve">where the media files should be saved</w:t>
       </w:r>
     </w:p>
     <w:p>
@@ -1408,7 +1439,7 @@
           <w:szCs w:val="24"/>
           <w:rtl w:val="0"/>
         </w:rPr>
-        <w:t xml:space="preserve">Run command node node packageHashing.js </w:t>
+        <w:t xml:space="preserve">Run command node packageHashing.js </w:t>
       </w:r>
     </w:p>
     <w:p>

</xml_diff>